<commit_message>
Clean up file sys
</commit_message>
<xml_diff>
--- a/docs/2026/04-iscecoSoftwareModellierung.docx
+++ b/docs/2026/04-iscecoSoftwareModellierung.docx
@@ -928,6 +928,126 @@
                 <w:lang w:eastAsia="en-US"/>
               </w:rPr>
               <w:t>Jameleddine Ben Jemaa</w:t>
+            </w:r>
+          </w:p>
+        </w:tc>
+      </w:tr>
+      <w:tr>
+        <w:tc>
+          <w:tcPr>
+            <w:tcW w:w="1242" w:type="dxa"/>
+            <w:tcBorders>
+              <w:top w:val="single" w:sz="6" w:space="0" w:color="000000"/>
+              <w:left w:val="single" w:sz="6" w:space="0" w:color="000000"/>
+              <w:bottom w:val="single" w:sz="6" w:space="0" w:color="000000"/>
+              <w:right w:val="single" w:sz="6" w:space="0" w:color="000000"/>
+            </w:tcBorders>
+          </w:tcPr>
+          <w:p>
+            <w:pPr>
+              <w:keepLines/>
+              <w:widowControl w:val="0"/>
+              <w:spacing w:before="60" w:after="60" w:line="240" w:lineRule="atLeast"/>
+              <w:jc w:val="center"/>
+              <w:rPr>
+                <w:sz w:val="20"/>
+                <w:szCs w:val="20"/>
+                <w:lang w:eastAsia="en-US"/>
+              </w:rPr>
+            </w:pPr>
+            <w:r>
+              <w:rPr>
+                <w:sz w:val="20"/>
+                <w:szCs w:val="20"/>
+                <w:lang w:eastAsia="en-US"/>
+              </w:rPr>
+              <w:t>23.04.2026</w:t>
+            </w:r>
+          </w:p>
+        </w:tc>
+        <w:tc>
+          <w:tcPr>
+            <w:tcW w:w="993" w:type="dxa"/>
+            <w:tcBorders>
+              <w:top w:val="single" w:sz="6" w:space="0" w:color="000000"/>
+              <w:left w:val="single" w:sz="6" w:space="0" w:color="000000"/>
+              <w:bottom w:val="single" w:sz="6" w:space="0" w:color="000000"/>
+              <w:right w:val="single" w:sz="6" w:space="0" w:color="000000"/>
+            </w:tcBorders>
+          </w:tcPr>
+          <w:p>
+            <w:pPr>
+              <w:keepLines/>
+              <w:widowControl w:val="0"/>
+              <w:spacing w:before="60" w:after="60" w:line="240" w:lineRule="atLeast"/>
+              <w:jc w:val="center"/>
+              <w:rPr>
+                <w:sz w:val="20"/>
+                <w:szCs w:val="20"/>
+                <w:lang w:eastAsia="en-US"/>
+              </w:rPr>
+            </w:pPr>
+          </w:p>
+        </w:tc>
+        <w:tc>
+          <w:tcPr>
+            <w:tcW w:w="4742" w:type="dxa"/>
+            <w:tcBorders>
+              <w:top w:val="single" w:sz="6" w:space="0" w:color="000000"/>
+              <w:left w:val="single" w:sz="6" w:space="0" w:color="000000"/>
+              <w:bottom w:val="single" w:sz="6" w:space="0" w:color="000000"/>
+              <w:right w:val="single" w:sz="6" w:space="0" w:color="000000"/>
+            </w:tcBorders>
+          </w:tcPr>
+          <w:p>
+            <w:pPr>
+              <w:keepLines/>
+              <w:widowControl w:val="0"/>
+              <w:spacing w:before="60" w:after="60" w:line="240" w:lineRule="atLeast"/>
+              <w:rPr>
+                <w:sz w:val="20"/>
+                <w:szCs w:val="20"/>
+                <w:lang w:eastAsia="en-US"/>
+              </w:rPr>
+            </w:pPr>
+            <w:r>
+              <w:rPr>
+                <w:sz w:val="20"/>
+                <w:szCs w:val="20"/>
+                <w:lang w:eastAsia="en-US"/>
+              </w:rPr>
+              <w:t>Review</w:t>
+            </w:r>
+          </w:p>
+        </w:tc>
+        <w:tc>
+          <w:tcPr>
+            <w:tcW w:w="2491" w:type="dxa"/>
+            <w:tcBorders>
+              <w:top w:val="single" w:sz="6" w:space="0" w:color="000000"/>
+              <w:left w:val="single" w:sz="6" w:space="0" w:color="000000"/>
+              <w:bottom w:val="single" w:sz="6" w:space="0" w:color="000000"/>
+              <w:right w:val="single" w:sz="6" w:space="0" w:color="000000"/>
+            </w:tcBorders>
+          </w:tcPr>
+          <w:p>
+            <w:pPr>
+              <w:keepLines/>
+              <w:widowControl w:val="0"/>
+              <w:spacing w:before="60" w:after="60" w:line="240" w:lineRule="atLeast"/>
+              <w:rPr>
+                <w:sz w:val="20"/>
+                <w:szCs w:val="20"/>
+                <w:lang w:eastAsia="en-US"/>
+              </w:rPr>
+            </w:pPr>
+            <w:r>
+              <w:rPr>
+                <w:sz w:val="20"/>
+                <w:szCs w:val="20"/>
+                <w:lang w:eastAsia="en-US"/>
+              </w:rPr>
+              <w:t>Stephan Zigerli</w:t>
             </w:r>
           </w:p>
         </w:tc>
@@ -2865,7 +2985,7 @@
                 <w:noProof/>
                 <w:webHidden/>
               </w:rPr>
-              <w:t>19</w:t>
+              <w:t>18</w:t>
             </w:r>
             <w:r>
               <w:rPr>
@@ -6350,12 +6470,10 @@
       <w:pPr>
         <w:pStyle w:val="berschrift1"/>
       </w:pPr>
-      <w:bookmarkStart w:id="9" w:name="_Toc227830311"/>
       <w:r>
         <w:lastRenderedPageBreak/>
-        <w:t>Assessments</w:t>
+        <w:t>Aufgaben</w:t>
       </w:r>
-      <w:bookmarkEnd w:id="9"/>
     </w:p>
     <w:p>
       <w:pPr>
@@ -6423,17 +6541,17 @@
       <w:pPr>
         <w:pStyle w:val="berschrift2"/>
       </w:pPr>
-      <w:bookmarkStart w:id="10" w:name="_Toc227830312"/>
+      <w:bookmarkStart w:id="9" w:name="_Toc227830312"/>
       <w:r>
-        <w:t xml:space="preserve">Assessment 1 – </w:t>
+        <w:t>Aufgabe</w:t>
       </w:r>
       <w:r>
-        <w:t xml:space="preserve">Bon App - </w:t>
+        <w:t xml:space="preserve"> 1</w:t>
       </w:r>
       <w:r>
-        <w:t>Schwierigkeitsgrad: Leicht</w:t>
+        <w:t>: Wir kochen Spaghetti</w:t>
       </w:r>
-      <w:bookmarkEnd w:id="10"/>
+      <w:bookmarkEnd w:id="9"/>
     </w:p>
     <w:p>
       <w:pPr>
@@ -6869,12 +6987,12 @@
       <w:pPr>
         <w:pStyle w:val="berschrift3"/>
       </w:pPr>
-      <w:bookmarkStart w:id="11" w:name="_Toc227830313"/>
+      <w:bookmarkStart w:id="10" w:name="_Toc227830313"/>
       <w:r>
         <w:lastRenderedPageBreak/>
         <w:t>Flussdiagramm</w:t>
       </w:r>
-      <w:bookmarkEnd w:id="11"/>
+      <w:bookmarkEnd w:id="10"/>
       <w:r>
         <w:br w:type="page"/>
       </w:r>
@@ -6883,12 +7001,12 @@
       <w:pPr>
         <w:pStyle w:val="berschrift3"/>
       </w:pPr>
-      <w:bookmarkStart w:id="12" w:name="_Toc227830314"/>
+      <w:bookmarkStart w:id="11" w:name="_Toc227830314"/>
       <w:r>
         <w:lastRenderedPageBreak/>
         <w:t>Struktogramm</w:t>
       </w:r>
-      <w:bookmarkEnd w:id="12"/>
+      <w:bookmarkEnd w:id="11"/>
     </w:p>
     <w:p>
       <w:pPr>
@@ -6909,10 +7027,13 @@
       <w:pPr>
         <w:pStyle w:val="berschrift2"/>
       </w:pPr>
-      <w:bookmarkStart w:id="13" w:name="_Toc227830315"/>
+      <w:bookmarkStart w:id="12" w:name="_Toc227830315"/>
       <w:r>
         <w:lastRenderedPageBreak/>
-        <w:t xml:space="preserve">Assessment 2 – </w:t>
+        <w:t>Aufgabe</w:t>
+      </w:r>
+      <w:r>
+        <w:t xml:space="preserve"> 2 – </w:t>
       </w:r>
       <w:r>
         <w:t xml:space="preserve">Sport </w:t>
@@ -6921,15 +7042,9 @@
         <w:t>im</w:t>
       </w:r>
       <w:r>
-        <w:t xml:space="preserve"> Fitnessstudio - </w:t>
+        <w:t xml:space="preserve"> Fitnessstudio</w:t>
       </w:r>
-      <w:r>
-        <w:t>Schwierigkeitsgrad: Mittel</w:t>
-      </w:r>
-      <w:r>
-        <w:t>:</w:t>
-      </w:r>
-      <w:bookmarkEnd w:id="13"/>
+      <w:bookmarkEnd w:id="12"/>
     </w:p>
     <w:p>
       <w:pPr>
@@ -7036,11 +7151,11 @@
       <w:pPr>
         <w:pStyle w:val="berschrift3"/>
       </w:pPr>
-      <w:bookmarkStart w:id="14" w:name="_Toc227830316"/>
+      <w:bookmarkStart w:id="13" w:name="_Toc227830316"/>
       <w:r>
         <w:t>Flussdiagramm</w:t>
       </w:r>
-      <w:bookmarkEnd w:id="14"/>
+      <w:bookmarkEnd w:id="13"/>
       <w:r>
         <w:br w:type="page"/>
       </w:r>
@@ -7049,12 +7164,12 @@
       <w:pPr>
         <w:pStyle w:val="berschrift3"/>
       </w:pPr>
-      <w:bookmarkStart w:id="15" w:name="_Toc227830317"/>
+      <w:bookmarkStart w:id="14" w:name="_Toc227830317"/>
       <w:r>
         <w:lastRenderedPageBreak/>
         <w:t>Struktogramm</w:t>
       </w:r>
-      <w:bookmarkEnd w:id="15"/>
+      <w:bookmarkEnd w:id="14"/>
     </w:p>
     <w:p>
       <w:pPr>
@@ -7075,18 +7190,21 @@
       <w:pPr>
         <w:pStyle w:val="berschrift2"/>
       </w:pPr>
-      <w:bookmarkStart w:id="16" w:name="_Toc227830318"/>
+      <w:bookmarkStart w:id="15" w:name="_Toc227830318"/>
       <w:r>
         <w:lastRenderedPageBreak/>
-        <w:t xml:space="preserve">Assessment 3 – </w:t>
+        <w:t>Aufgabe</w:t>
       </w:r>
       <w:r>
-        <w:t xml:space="preserve">Ausgabe von ungeraden Zahlen  - </w:t>
+        <w:t xml:space="preserve"> 3 – </w:t>
       </w:r>
       <w:r>
-        <w:t>Schwierigkeitsgrad: schwer</w:t>
+        <w:t>Ausgabe von ungeraden Zahle</w:t>
       </w:r>
-      <w:bookmarkEnd w:id="16"/>
+      <w:bookmarkEnd w:id="15"/>
+      <w:r>
+        <w:t>n</w:t>
+      </w:r>
     </w:p>
     <w:p>
       <w:pPr>
@@ -7098,7 +7216,7 @@
         <w:rPr>
           <w:lang w:eastAsia="en-US"/>
         </w:rPr>
-        <w:t>Diese Aufgabe besteht ganz einfach darin, die ungeraden Zahlen zwischen 0 und 100 auszugeben. Dabei müssen folgende Bedingungen erfüllt sein:</w:t>
+        <w:t>Diese Aufgabe besteht darin, die ungeraden Zahlen zwischen 0 und 100 auszugeben. Dabei müssen folgende Bedingungen erfüllt sein:</w:t>
       </w:r>
     </w:p>
     <w:p>
@@ -7183,11 +7301,11 @@
       <w:pPr>
         <w:pStyle w:val="berschrift3"/>
       </w:pPr>
-      <w:bookmarkStart w:id="17" w:name="_Toc227830319"/>
+      <w:bookmarkStart w:id="16" w:name="_Toc227830319"/>
       <w:r>
         <w:t>Flussdiagramm</w:t>
       </w:r>
-      <w:bookmarkEnd w:id="17"/>
+      <w:bookmarkEnd w:id="16"/>
       <w:r>
         <w:br w:type="page"/>
       </w:r>
@@ -7196,12 +7314,12 @@
       <w:pPr>
         <w:pStyle w:val="berschrift3"/>
       </w:pPr>
-      <w:bookmarkStart w:id="18" w:name="_Toc227830320"/>
+      <w:bookmarkStart w:id="17" w:name="_Toc227830320"/>
       <w:r>
         <w:lastRenderedPageBreak/>
         <w:t>Struktogramm</w:t>
       </w:r>
-      <w:bookmarkEnd w:id="18"/>
+      <w:bookmarkEnd w:id="17"/>
     </w:p>
     <w:p>
       <w:pPr>
@@ -7221,7 +7339,7 @@
       <w:pPr>
         <w:pStyle w:val="berschrift3"/>
       </w:pPr>
-      <w:bookmarkStart w:id="19" w:name="_Toc227830321"/>
+      <w:bookmarkStart w:id="18" w:name="_Toc227830321"/>
       <w:r>
         <w:rPr>
           <w:noProof/>
@@ -7289,7 +7407,25 @@
                                 <w:color w:val="EE0000"/>
                                 <w:lang w:eastAsia="en-US"/>
                               </w:rPr>
-                              <w:t>Wie sieht das Flussdiagrammaus unter folgenden Bedingungen:</w:t>
+                              <w:t>Wie sieht das Flussdiagramm</w:t>
+                            </w:r>
+                            <w:r>
+                              <w:rPr>
+                                <w:b/>
+                                <w:bCs/>
+                                <w:color w:val="EE0000"/>
+                                <w:lang w:eastAsia="en-US"/>
+                              </w:rPr>
+                              <w:t xml:space="preserve"> </w:t>
+                            </w:r>
+                            <w:r>
+                              <w:rPr>
+                                <w:b/>
+                                <w:bCs/>
+                                <w:color w:val="EE0000"/>
+                                <w:lang w:eastAsia="en-US"/>
+                              </w:rPr>
+                              <w:t>aus unter folgenden Bedingungen:</w:t>
                             </w:r>
                           </w:p>
                           <w:p>
@@ -7361,7 +7497,7 @@
                                 <w:color w:val="EE0000"/>
                                 <w:lang w:eastAsia="en-US"/>
                               </w:rPr>
-                              <w:t>Die Zahl ist weder durch 3 noch durch 4, noch durch 1 teilbar</w:t>
+                              <w:t>Die Zahl ist weder durch 3 noch durch 4 noch durch 1 teilbar</w:t>
                             </w:r>
                           </w:p>
                           <w:p/>
@@ -7403,7 +7539,25 @@
                           <w:color w:val="EE0000"/>
                           <w:lang w:eastAsia="en-US"/>
                         </w:rPr>
-                        <w:t>Wie sieht das Flussdiagrammaus unter folgenden Bedingungen:</w:t>
+                        <w:t>Wie sieht das Flussdiagramm</w:t>
+                      </w:r>
+                      <w:r>
+                        <w:rPr>
+                          <w:b/>
+                          <w:bCs/>
+                          <w:color w:val="EE0000"/>
+                          <w:lang w:eastAsia="en-US"/>
+                        </w:rPr>
+                        <w:t xml:space="preserve"> </w:t>
+                      </w:r>
+                      <w:r>
+                        <w:rPr>
+                          <w:b/>
+                          <w:bCs/>
+                          <w:color w:val="EE0000"/>
+                          <w:lang w:eastAsia="en-US"/>
+                        </w:rPr>
+                        <w:t>aus unter folgenden Bedingungen:</w:t>
                       </w:r>
                     </w:p>
                     <w:p>
@@ -7475,7 +7629,7 @@
                           <w:color w:val="EE0000"/>
                           <w:lang w:eastAsia="en-US"/>
                         </w:rPr>
-                        <w:t>Die Zahl ist weder durch 3 noch durch 4, noch durch 1 teilbar</w:t>
+                        <w:t>Die Zahl ist weder durch 3 noch durch 4 noch durch 1 teilbar</w:t>
                       </w:r>
                     </w:p>
                     <w:p/>
@@ -7488,14 +7642,15 @@
         </mc:AlternateContent>
       </w:r>
       <w:r>
-        <w:t>Quizz-</w:t>
+        <w:t>Quizz-F</w:t>
       </w:r>
-      <w:proofErr w:type="spellStart"/>
       <w:r>
-        <w:t>Fage</w:t>
+        <w:t>r</w:t>
       </w:r>
-      <w:bookmarkEnd w:id="19"/>
-      <w:proofErr w:type="spellEnd"/>
+      <w:r>
+        <w:t>age</w:t>
+      </w:r>
+      <w:bookmarkEnd w:id="18"/>
       <w:r>
         <w:br w:type="page"/>
       </w:r>
@@ -7504,25 +7659,25 @@
       <w:pPr>
         <w:pStyle w:val="berschrift1"/>
       </w:pPr>
-      <w:bookmarkStart w:id="20" w:name="_Toc227830322"/>
+      <w:bookmarkStart w:id="19" w:name="_Toc227830322"/>
       <w:r>
         <w:lastRenderedPageBreak/>
-        <w:t>A</w:t>
+        <w:t>Aufgabenbe</w:t>
       </w:r>
       <w:r>
-        <w:t>ssessment-Bewertung</w:t>
+        <w:t>wertung</w:t>
       </w:r>
-      <w:bookmarkEnd w:id="20"/>
+      <w:bookmarkEnd w:id="19"/>
     </w:p>
     <w:p>
       <w:pPr>
         <w:pStyle w:val="berschrift2"/>
       </w:pPr>
-      <w:bookmarkStart w:id="21" w:name="_Toc227830323"/>
+      <w:bookmarkStart w:id="20" w:name="_Toc227830323"/>
       <w:r>
         <w:t>Bewertungskriterien</w:t>
       </w:r>
-      <w:bookmarkEnd w:id="21"/>
+      <w:bookmarkEnd w:id="20"/>
     </w:p>
     <w:p>
       <w:pPr>
@@ -8589,12 +8744,37 @@
     <w:p>
       <w:pPr>
         <w:pStyle w:val="berschrift2"/>
-      </w:pPr>
-      <w:bookmarkStart w:id="22" w:name="_Toc227830324"/>
+        <w:numPr>
+          <w:ilvl w:val="0"/>
+          <w:numId w:val="0"/>
+        </w:numPr>
+      </w:pPr>
+      <w:bookmarkStart w:id="21" w:name="_Toc227830324"/>
+    </w:p>
+    <w:p>
+      <w:pPr>
+        <w:suppressAutoHyphens/>
+        <w:spacing w:after="0"/>
+        <w:rPr>
+          <w:b/>
+          <w:sz w:val="24"/>
+          <w:szCs w:val="20"/>
+          <w:lang w:eastAsia="en-US"/>
+        </w:rPr>
+      </w:pPr>
       <w:r>
+        <w:br w:type="page"/>
+      </w:r>
+    </w:p>
+    <w:p>
+      <w:pPr>
+        <w:pStyle w:val="berschrift2"/>
+      </w:pPr>
+      <w:r>
+        <w:lastRenderedPageBreak/>
         <w:t>Bewertung</w:t>
       </w:r>
-      <w:bookmarkEnd w:id="22"/>
+      <w:bookmarkEnd w:id="21"/>
     </w:p>
     <w:p>
       <w:pPr>
@@ -8762,7 +8942,15 @@
                 <w:bCs/>
                 <w:lang w:eastAsia="en-US"/>
               </w:rPr>
-              <w:t>Assessment 1</w:t>
+              <w:t>Aufgabe</w:t>
+            </w:r>
+            <w:r>
+              <w:rPr>
+                <w:b/>
+                <w:bCs/>
+                <w:lang w:eastAsia="en-US"/>
+              </w:rPr>
+              <w:t xml:space="preserve"> 1</w:t>
             </w:r>
           </w:p>
         </w:tc>
@@ -9064,7 +9252,7 @@
                 <w:bCs/>
                 <w:lang w:eastAsia="en-US"/>
               </w:rPr>
-              <w:t>Assessment</w:t>
+              <w:t>Aufgabe</w:t>
             </w:r>
             <w:r>
               <w:rPr>
@@ -9382,7 +9570,23 @@
                 <w:bCs/>
                 <w:lang w:eastAsia="en-US"/>
               </w:rPr>
-              <w:t>Assessment 3</w:t>
+              <w:t>Aufgabe</w:t>
+            </w:r>
+            <w:r>
+              <w:rPr>
+                <w:b/>
+                <w:bCs/>
+                <w:lang w:eastAsia="en-US"/>
+              </w:rPr>
+              <w:t xml:space="preserve"> </w:t>
+            </w:r>
+            <w:r>
+              <w:rPr>
+                <w:b/>
+                <w:bCs/>
+                <w:lang w:eastAsia="en-US"/>
+              </w:rPr>
+              <w:t>3</w:t>
             </w:r>
           </w:p>
         </w:tc>
@@ -9776,22 +9980,28 @@
       <w:pPr>
         <w:pStyle w:val="berschrift1"/>
       </w:pPr>
-      <w:bookmarkStart w:id="23" w:name="_Toc227830325"/>
+      <w:bookmarkStart w:id="22" w:name="_Toc227830325"/>
       <w:r>
         <w:lastRenderedPageBreak/>
         <w:t>Anhang</w:t>
       </w:r>
-      <w:bookmarkEnd w:id="23"/>
+      <w:bookmarkEnd w:id="22"/>
     </w:p>
     <w:p>
       <w:pPr>
         <w:pStyle w:val="berschrift2"/>
       </w:pPr>
-      <w:bookmarkStart w:id="24" w:name="_Toc227830326"/>
+      <w:bookmarkStart w:id="23" w:name="_Toc227830326"/>
       <w:r>
-        <w:t>Assessment-Repo</w:t>
+        <w:t>Aufgaben</w:t>
       </w:r>
-      <w:bookmarkEnd w:id="24"/>
+      <w:r>
+        <w:t>-Repo</w:t>
+      </w:r>
+      <w:bookmarkEnd w:id="23"/>
+      <w:r>
+        <w:t>sitory</w:t>
+      </w:r>
     </w:p>
     <w:p>
       <w:pPr>
@@ -9799,16 +10009,39 @@
           <w:lang w:eastAsia="en-US"/>
         </w:rPr>
       </w:pPr>
+      <w:r>
+        <w:rPr>
+          <w:lang w:eastAsia="en-US"/>
+        </w:rPr>
+        <w:t xml:space="preserve">Diese Aufgaben sind öffentlich auf </w:t>
+      </w:r>
+      <w:hyperlink r:id="rId34" w:history="1">
+        <w:proofErr w:type="spellStart"/>
+        <w:r>
+          <w:rPr>
+            <w:rStyle w:val="Hyperlink"/>
+            <w:lang w:eastAsia="en-US"/>
+          </w:rPr>
+          <w:t>Github</w:t>
+        </w:r>
+        <w:proofErr w:type="spellEnd"/>
+      </w:hyperlink>
+      <w:r>
+        <w:rPr>
+          <w:lang w:eastAsia="en-US"/>
+        </w:rPr>
+        <w:t xml:space="preserve"> verfügbar.</w:t>
+      </w:r>
     </w:p>
     <w:p>
       <w:pPr>
         <w:pStyle w:val="berschrift2"/>
       </w:pPr>
-      <w:bookmarkStart w:id="25" w:name="_Toc227830327"/>
+      <w:bookmarkStart w:id="24" w:name="_Toc227830327"/>
       <w:r>
         <w:t>Glossar</w:t>
       </w:r>
-      <w:bookmarkEnd w:id="25"/>
+      <w:bookmarkEnd w:id="24"/>
     </w:p>
     <w:tbl>
       <w:tblPr>
@@ -10041,7 +10274,7 @@
                 <w:lang w:eastAsia="en-US"/>
               </w:rPr>
             </w:pPr>
-            <w:hyperlink r:id="rId34" w:history="1">
+            <w:hyperlink r:id="rId35" w:history="1">
               <w:r>
                 <w:rPr>
                   <w:rStyle w:val="Hyperlink"/>
@@ -10154,7 +10387,7 @@
                 <w:lang w:eastAsia="en-US"/>
               </w:rPr>
             </w:pPr>
-            <w:hyperlink r:id="rId35" w:history="1">
+            <w:hyperlink r:id="rId36" w:history="1">
               <w:r>
                 <w:rPr>
                   <w:rStyle w:val="Hyperlink"/>
@@ -10219,7 +10452,7 @@
                 <w:lang w:eastAsia="en-US"/>
               </w:rPr>
             </w:pPr>
-            <w:hyperlink r:id="rId36" w:history="1">
+            <w:hyperlink r:id="rId37" w:history="1">
               <w:r>
                 <w:rPr>
                   <w:rStyle w:val="Hyperlink"/>
@@ -10247,11 +10480,11 @@
       <w:pPr>
         <w:pStyle w:val="berschrift2"/>
       </w:pPr>
-      <w:bookmarkStart w:id="26" w:name="_Toc227830328"/>
+      <w:bookmarkStart w:id="25" w:name="_Toc227830328"/>
       <w:r>
         <w:t>Referenzen</w:t>
       </w:r>
-      <w:bookmarkEnd w:id="26"/>
+      <w:bookmarkEnd w:id="25"/>
     </w:p>
     <w:tbl>
       <w:tblPr>
@@ -10341,7 +10574,7 @@
                 <w:lang w:eastAsia="en-US"/>
               </w:rPr>
             </w:pPr>
-            <w:hyperlink r:id="rId37" w:history="1">
+            <w:hyperlink r:id="rId38" w:history="1">
               <w:r>
                 <w:rPr>
                   <w:rStyle w:val="Hyperlink"/>
@@ -10377,7 +10610,7 @@
                 <w:lang w:eastAsia="en-US"/>
               </w:rPr>
             </w:pPr>
-            <w:hyperlink r:id="rId38" w:history="1">
+            <w:hyperlink r:id="rId39" w:history="1">
               <w:r>
                 <w:rPr>
                   <w:rStyle w:val="Hyperlink"/>
@@ -10419,49 +10652,13 @@
                 <w:lang w:eastAsia="en-US"/>
               </w:rPr>
             </w:pPr>
-            <w:hyperlink r:id="rId39" w:history="1">
+            <w:hyperlink r:id="rId40" w:history="1">
               <w:r>
                 <w:rPr>
                   <w:rStyle w:val="Hyperlink"/>
                   <w:lang w:eastAsia="en-US"/>
                 </w:rPr>
                 <w:t>Struktogramme</w:t>
-              </w:r>
-            </w:hyperlink>
-          </w:p>
-        </w:tc>
-      </w:tr>
-      <w:tr>
-        <w:tc>
-          <w:tcPr>
-            <w:tcW w:w="3256" w:type="dxa"/>
-            <w:vMerge/>
-          </w:tcPr>
-          <w:p>
-            <w:pPr>
-              <w:rPr>
-                <w:lang w:eastAsia="en-US"/>
-              </w:rPr>
-            </w:pPr>
-          </w:p>
-        </w:tc>
-        <w:tc>
-          <w:tcPr>
-            <w:tcW w:w="5760" w:type="dxa"/>
-          </w:tcPr>
-          <w:p>
-            <w:pPr>
-              <w:rPr>
-                <w:lang w:eastAsia="en-US"/>
-              </w:rPr>
-            </w:pPr>
-            <w:hyperlink r:id="rId40" w:history="1">
-              <w:r>
-                <w:rPr>
-                  <w:rStyle w:val="Hyperlink"/>
-                  <w:lang w:eastAsia="en-US"/>
-                </w:rPr>
-                <w:t>Struktogramme lesen, verstehen und entwickeln</w:t>
               </w:r>
             </w:hyperlink>
           </w:p>
@@ -10533,6 +10730,42 @@
                   <w:rStyle w:val="Hyperlink"/>
                   <w:lang w:eastAsia="en-US"/>
                 </w:rPr>
+                <w:t>Struktogramme lesen, verstehen und entwickeln</w:t>
+              </w:r>
+            </w:hyperlink>
+          </w:p>
+        </w:tc>
+      </w:tr>
+      <w:tr>
+        <w:tc>
+          <w:tcPr>
+            <w:tcW w:w="3256" w:type="dxa"/>
+            <w:vMerge/>
+          </w:tcPr>
+          <w:p>
+            <w:pPr>
+              <w:rPr>
+                <w:lang w:eastAsia="en-US"/>
+              </w:rPr>
+            </w:pPr>
+          </w:p>
+        </w:tc>
+        <w:tc>
+          <w:tcPr>
+            <w:tcW w:w="5760" w:type="dxa"/>
+          </w:tcPr>
+          <w:p>
+            <w:pPr>
+              <w:rPr>
+                <w:lang w:eastAsia="en-US"/>
+              </w:rPr>
+            </w:pPr>
+            <w:hyperlink r:id="rId43" w:history="1">
+              <w:r>
+                <w:rPr>
+                  <w:rStyle w:val="Hyperlink"/>
+                  <w:lang w:eastAsia="en-US"/>
+                </w:rPr>
                 <w:t>Fachkonzept: Struktogramm [Wiki: Mathe und Info]</w:t>
               </w:r>
             </w:hyperlink>
@@ -10563,7 +10796,7 @@
                 <w:lang w:eastAsia="en-US"/>
               </w:rPr>
             </w:pPr>
-            <w:hyperlink r:id="rId43" w:history="1">
+            <w:hyperlink r:id="rId44" w:history="1">
               <w:r>
                 <w:rPr>
                   <w:rStyle w:val="Hyperlink"/>
@@ -10599,7 +10832,7 @@
                 <w:lang w:eastAsia="en-US"/>
               </w:rPr>
             </w:pPr>
-            <w:hyperlink r:id="rId44" w:history="1">
+            <w:hyperlink r:id="rId45" w:history="1">
               <w:r>
                 <w:rPr>
                   <w:rStyle w:val="Hyperlink"/>
@@ -10651,7 +10884,7 @@
                 <w:lang w:eastAsia="en-US"/>
               </w:rPr>
             </w:pPr>
-            <w:hyperlink r:id="rId45" w:history="1">
+            <w:hyperlink r:id="rId46" w:history="1">
               <w:r>
                 <w:rPr>
                   <w:rStyle w:val="Hyperlink"/>
@@ -10681,17 +10914,11 @@
     </w:p>
     <w:p>
       <w:pPr>
-        <w:rPr>
-          <w:lang w:eastAsia="en-US"/>
-        </w:rPr>
-      </w:pPr>
-    </w:p>
-    <w:p>
-      <w:pPr>
         <w:pStyle w:val="berschrift2"/>
       </w:pPr>
-      <w:bookmarkStart w:id="27" w:name="_Toc227830329"/>
+      <w:bookmarkStart w:id="26" w:name="_Toc227830329"/>
       <w:r>
+        <w:lastRenderedPageBreak/>
         <w:t xml:space="preserve">Weitere </w:t>
       </w:r>
       <w:r>
@@ -10700,7 +10927,7 @@
       <w:r>
         <w:t>riterien</w:t>
       </w:r>
-      <w:bookmarkEnd w:id="27"/>
+      <w:bookmarkEnd w:id="26"/>
     </w:p>
     <w:tbl>
       <w:tblPr>
@@ -11392,17 +11619,6 @@
     </w:tbl>
     <w:p>
       <w:pPr>
-        <w:pStyle w:val="Textkrper"/>
-        <w:rPr>
-          <w:rFonts w:cs="Arial"/>
-          <w:sz w:val="22"/>
-          <w:szCs w:val="22"/>
-          <w:lang w:val="de-CH"/>
-        </w:rPr>
-      </w:pPr>
-    </w:p>
-    <w:p>
-      <w:pPr>
         <w:suppressAutoHyphens/>
         <w:spacing w:after="0"/>
         <w:rPr>
@@ -11411,13 +11627,6 @@
           <w:lang w:eastAsia="en-US"/>
         </w:rPr>
       </w:pPr>
-      <w:r>
-        <w:rPr>
-          <w:rFonts w:cs="Arial"/>
-          <w:szCs w:val="22"/>
-        </w:rPr>
-        <w:br w:type="page"/>
-      </w:r>
     </w:p>
     <w:tbl>
       <w:tblPr>
@@ -11454,7 +11663,6 @@
                 <w:szCs w:val="22"/>
                 <w:lang w:val="de-CH"/>
               </w:rPr>
-              <w:lastRenderedPageBreak/>
               <w:t>I2</w:t>
             </w:r>
           </w:p>
@@ -11728,16 +11936,290 @@
           </w:p>
         </w:tc>
       </w:tr>
+      <w:tr>
+        <w:tc>
+          <w:tcPr>
+            <w:tcW w:w="1418" w:type="dxa"/>
+            <w:shd w:val="clear" w:color="auto" w:fill="D9D9D9" w:themeFill="background1" w:themeFillShade="D9"/>
+          </w:tcPr>
+          <w:p>
+            <w:pPr>
+              <w:pStyle w:val="Textkrper"/>
+              <w:ind w:left="0"/>
+              <w:rPr>
+                <w:rFonts w:cs="Arial"/>
+                <w:sz w:val="22"/>
+                <w:szCs w:val="22"/>
+                <w:lang w:val="de-CH"/>
+              </w:rPr>
+            </w:pPr>
+            <w:r>
+              <w:rPr>
+                <w:rFonts w:cs="Arial"/>
+                <w:sz w:val="22"/>
+                <w:szCs w:val="22"/>
+                <w:lang w:val="de-CH"/>
+              </w:rPr>
+              <w:lastRenderedPageBreak/>
+              <w:t>I5</w:t>
+            </w:r>
+          </w:p>
+        </w:tc>
+        <w:tc>
+          <w:tcPr>
+            <w:tcW w:w="7745" w:type="dxa"/>
+            <w:shd w:val="clear" w:color="auto" w:fill="D9D9D9" w:themeFill="background1" w:themeFillShade="D9"/>
+          </w:tcPr>
+          <w:p>
+            <w:pPr>
+              <w:rPr>
+                <w:rFonts w:cs="Arial"/>
+                <w:b/>
+                <w:bCs/>
+                <w:szCs w:val="22"/>
+              </w:rPr>
+            </w:pPr>
+            <w:proofErr w:type="spellStart"/>
+            <w:r>
+              <w:rPr>
+                <w:rFonts w:cs="Arial"/>
+                <w:b/>
+                <w:bCs/>
+                <w:szCs w:val="22"/>
+              </w:rPr>
+              <w:t>Codingstyle</w:t>
+            </w:r>
+            <w:proofErr w:type="spellEnd"/>
+            <w:r>
+              <w:rPr>
+                <w:rFonts w:cs="Arial"/>
+                <w:b/>
+                <w:bCs/>
+                <w:szCs w:val="22"/>
+              </w:rPr>
+              <w:t xml:space="preserve"> - lesbarer Code</w:t>
+            </w:r>
+          </w:p>
+          <w:p>
+            <w:pPr>
+              <w:rPr>
+                <w:rFonts w:cs="Arial"/>
+                <w:szCs w:val="22"/>
+              </w:rPr>
+            </w:pPr>
+            <w:r>
+              <w:rPr>
+                <w:rFonts w:cs="Arial"/>
+                <w:szCs w:val="22"/>
+              </w:rPr>
+              <w:t>Ist der Code lesbar geschrieben, gut gegliedert und ist die Namensgebung gut gewählt?</w:t>
+            </w:r>
+          </w:p>
+        </w:tc>
+      </w:tr>
+      <w:tr>
+        <w:tc>
+          <w:tcPr>
+            <w:tcW w:w="1418" w:type="dxa"/>
+          </w:tcPr>
+          <w:p>
+            <w:pPr>
+              <w:pStyle w:val="Textkrper"/>
+              <w:ind w:left="0"/>
+              <w:rPr>
+                <w:rFonts w:cs="Arial"/>
+                <w:sz w:val="22"/>
+                <w:szCs w:val="22"/>
+                <w:lang w:val="de-CH"/>
+              </w:rPr>
+            </w:pPr>
+            <w:r>
+              <w:rPr>
+                <w:rFonts w:cs="Arial"/>
+                <w:sz w:val="22"/>
+                <w:szCs w:val="22"/>
+                <w:lang w:val="de-CH"/>
+              </w:rPr>
+              <w:t xml:space="preserve">Gütestufe 3 </w:t>
+            </w:r>
+          </w:p>
+        </w:tc>
+        <w:tc>
+          <w:tcPr>
+            <w:tcW w:w="7745" w:type="dxa"/>
+          </w:tcPr>
+          <w:p>
+            <w:pPr>
+              <w:rPr>
+                <w:rFonts w:cs="Arial"/>
+                <w:szCs w:val="22"/>
+              </w:rPr>
+            </w:pPr>
+            <w:r>
+              <w:rPr>
+                <w:rFonts w:cs="Arial"/>
+                <w:szCs w:val="22"/>
+              </w:rPr>
+              <w:t>Die Namensgebung entspricht den Vorgaben oder ist einfach gut gewählt. Die Struktur des Codes ist ebenfalls gemäss möglicher Richtlinien oder einfach übersichtlich gemacht. Es ist eine gewisse Einheit zu sehen in der Art und Weise, wie der Code strukturiert ist (d.h. es ist überall etwa gleich gemacht).</w:t>
+            </w:r>
+          </w:p>
+        </w:tc>
+      </w:tr>
+      <w:tr>
+        <w:tc>
+          <w:tcPr>
+            <w:tcW w:w="1418" w:type="dxa"/>
+          </w:tcPr>
+          <w:p>
+            <w:pPr>
+              <w:pStyle w:val="Textkrper"/>
+              <w:ind w:left="0"/>
+              <w:rPr>
+                <w:rFonts w:cs="Arial"/>
+                <w:sz w:val="22"/>
+                <w:szCs w:val="22"/>
+                <w:lang w:val="de-CH"/>
+              </w:rPr>
+            </w:pPr>
+            <w:r>
+              <w:rPr>
+                <w:rFonts w:cs="Arial"/>
+                <w:sz w:val="22"/>
+                <w:szCs w:val="22"/>
+                <w:lang w:val="de-CH"/>
+              </w:rPr>
+              <w:t xml:space="preserve">Gütestufe 2 </w:t>
+            </w:r>
+          </w:p>
+        </w:tc>
+        <w:tc>
+          <w:tcPr>
+            <w:tcW w:w="7745" w:type="dxa"/>
+          </w:tcPr>
+          <w:p>
+            <w:pPr>
+              <w:pStyle w:val="Textkrper"/>
+              <w:ind w:left="0"/>
+              <w:rPr>
+                <w:rFonts w:cs="Arial"/>
+                <w:sz w:val="22"/>
+                <w:szCs w:val="22"/>
+                <w:lang w:val="de-CH"/>
+              </w:rPr>
+            </w:pPr>
+            <w:r>
+              <w:rPr>
+                <w:rFonts w:cs="Arial"/>
+                <w:sz w:val="22"/>
+                <w:szCs w:val="22"/>
+                <w:lang w:val="de-CH"/>
+              </w:rPr>
+              <w:t>Die Namensgebung ist ab und zu ungeschickt gewählt, Vorgaben sind teilweise berücksichtigt. Die Codestruktur ist uneinheitlich (so dass Lesbarkeit leidet).</w:t>
+            </w:r>
+          </w:p>
+        </w:tc>
+      </w:tr>
+      <w:tr>
+        <w:tc>
+          <w:tcPr>
+            <w:tcW w:w="1418" w:type="dxa"/>
+          </w:tcPr>
+          <w:p>
+            <w:pPr>
+              <w:pStyle w:val="Textkrper"/>
+              <w:ind w:left="0"/>
+              <w:rPr>
+                <w:rFonts w:cs="Arial"/>
+                <w:sz w:val="22"/>
+                <w:szCs w:val="22"/>
+                <w:lang w:val="de-CH"/>
+              </w:rPr>
+            </w:pPr>
+            <w:r>
+              <w:rPr>
+                <w:rFonts w:cs="Arial"/>
+                <w:sz w:val="22"/>
+                <w:szCs w:val="22"/>
+                <w:lang w:val="de-CH"/>
+              </w:rPr>
+              <w:t xml:space="preserve">Gütestufe 1 </w:t>
+            </w:r>
+          </w:p>
+        </w:tc>
+        <w:tc>
+          <w:tcPr>
+            <w:tcW w:w="7745" w:type="dxa"/>
+          </w:tcPr>
+          <w:p>
+            <w:pPr>
+              <w:rPr>
+                <w:rFonts w:cs="Arial"/>
+                <w:szCs w:val="22"/>
+              </w:rPr>
+            </w:pPr>
+            <w:r>
+              <w:rPr>
+                <w:rFonts w:cs="Arial"/>
+                <w:szCs w:val="22"/>
+              </w:rPr>
+              <w:t>Die Namensgebung ist öfters verwirrend oder unpräzise. Dem Code fehlt es an einigen Stellen an klarer Struktur. Vorgaben sind nicht berücksichtigt.</w:t>
+            </w:r>
+          </w:p>
+        </w:tc>
+      </w:tr>
+      <w:tr>
+        <w:tc>
+          <w:tcPr>
+            <w:tcW w:w="1418" w:type="dxa"/>
+          </w:tcPr>
+          <w:p>
+            <w:pPr>
+              <w:pStyle w:val="Textkrper"/>
+              <w:ind w:left="0"/>
+              <w:rPr>
+                <w:rFonts w:cs="Arial"/>
+                <w:sz w:val="22"/>
+                <w:szCs w:val="22"/>
+                <w:lang w:val="de-CH"/>
+              </w:rPr>
+            </w:pPr>
+            <w:r>
+              <w:rPr>
+                <w:rFonts w:cs="Arial"/>
+                <w:sz w:val="22"/>
+                <w:szCs w:val="22"/>
+                <w:lang w:val="de-CH"/>
+              </w:rPr>
+              <w:t xml:space="preserve">Gütestufe 0 </w:t>
+            </w:r>
+          </w:p>
+        </w:tc>
+        <w:tc>
+          <w:tcPr>
+            <w:tcW w:w="7745" w:type="dxa"/>
+          </w:tcPr>
+          <w:p>
+            <w:pPr>
+              <w:rPr>
+                <w:rFonts w:cs="Arial"/>
+                <w:szCs w:val="22"/>
+              </w:rPr>
+            </w:pPr>
+            <w:r>
+              <w:rPr>
+                <w:rFonts w:cs="Arial"/>
+                <w:szCs w:val="22"/>
+              </w:rPr>
+              <w:t>Die Namensgebung ist verwirrend oder unpräzise. Der Code ist schlecht lesbar.</w:t>
+            </w:r>
+          </w:p>
+        </w:tc>
+      </w:tr>
     </w:tbl>
     <w:p>
       <w:pPr>
-        <w:pStyle w:val="Textkrper"/>
-        <w:ind w:left="0"/>
-        <w:rPr>
-          <w:rFonts w:cs="Arial"/>
-          <w:sz w:val="22"/>
-          <w:szCs w:val="22"/>
-          <w:lang w:val="de-CH"/>
+        <w:rPr>
+          <w:lang w:eastAsia="en-US"/>
         </w:rPr>
       </w:pPr>
     </w:p>
@@ -11776,7 +12258,7 @@
                 <w:szCs w:val="22"/>
                 <w:lang w:val="de-CH"/>
               </w:rPr>
-              <w:t>I5</w:t>
+              <w:t>I6</w:t>
             </w:r>
           </w:p>
         </w:tc>
@@ -11789,45 +12271,45 @@
             <w:pPr>
               <w:rPr>
                 <w:rFonts w:cs="Arial"/>
-                <w:b/>
-                <w:bCs/>
                 <w:szCs w:val="22"/>
               </w:rPr>
             </w:pPr>
-            <w:proofErr w:type="spellStart"/>
-            <w:r>
-              <w:rPr>
-                <w:rFonts w:cs="Arial"/>
-                <w:b/>
-                <w:bCs/>
-                <w:szCs w:val="22"/>
-              </w:rPr>
-              <w:t>Codingstyle</w:t>
-            </w:r>
-            <w:proofErr w:type="spellEnd"/>
-            <w:r>
-              <w:rPr>
-                <w:rFonts w:cs="Arial"/>
-                <w:b/>
-                <w:bCs/>
-                <w:szCs w:val="22"/>
-              </w:rPr>
-              <w:t xml:space="preserve"> - lesbarer Code</w:t>
-            </w:r>
-          </w:p>
-          <w:p>
-            <w:pPr>
+            <w:r>
               <w:rPr>
                 <w:rFonts w:cs="Arial"/>
                 <w:szCs w:val="22"/>
               </w:rPr>
-            </w:pPr>
-            <w:r>
+              <w:t>Plausibilisierung der Benutzer-Eingaben</w:t>
+            </w:r>
+          </w:p>
+          <w:p>
+            <w:pPr>
               <w:rPr>
                 <w:rFonts w:cs="Arial"/>
                 <w:szCs w:val="22"/>
               </w:rPr>
-              <w:t>Ist der Code lesbar geschrieben, gut gegliedert und ist die Namensgebung gut gewählt?</w:t>
+            </w:pPr>
+            <w:r>
+              <w:rPr>
+                <w:rFonts w:cs="Arial"/>
+                <w:szCs w:val="22"/>
+              </w:rPr>
+              <w:t>Definition (Leitfrage)</w:t>
+            </w:r>
+          </w:p>
+          <w:p>
+            <w:pPr>
+              <w:rPr>
+                <w:rFonts w:cs="Arial"/>
+                <w:szCs w:val="22"/>
+              </w:rPr>
+            </w:pPr>
+            <w:r>
+              <w:rPr>
+                <w:rFonts w:cs="Arial"/>
+                <w:szCs w:val="22"/>
+              </w:rPr>
+              <w:t>Werden die Eingaben des Benutzers überprüft?</w:t>
             </w:r>
           </w:p>
         </w:tc>
@@ -11875,7 +12357,7 @@
                 <w:rFonts w:cs="Arial"/>
                 <w:szCs w:val="22"/>
               </w:rPr>
-              <w:t>Die Namensgebung entspricht den Vorgaben oder ist einfach gut gewählt. Die Struktur des Codes ist ebenfalls gemäss möglicher Richtlinien oder einfach übersichtlich gemacht. Es ist eine gewisse Einheit zu sehen in der Art und Weise, wie der Code strukturiert ist (d.h. es ist überall etwa gleich gemacht).</w:t>
+              <w:t>Alle Eingabefelder werden überprüft. Es ist eindeutig gekennzeichnet, welche Felder Pflichtfelder sind. Für den Benutzer ist ersichtlich, welche Wertebereiche zulässig sind. Findet die Plausibilisierung eine Fehleingabe, so wird der Benutzer mit konkreten Hinweisen geführt, das entsprechende Feld wird aktiviert.</w:t>
             </w:r>
           </w:p>
         </w:tc>
@@ -11913,6 +12395,28 @@
           </w:tcPr>
           <w:p>
             <w:pPr>
+              <w:rPr>
+                <w:rFonts w:cs="Arial"/>
+                <w:szCs w:val="22"/>
+              </w:rPr>
+            </w:pPr>
+            <w:r>
+              <w:rPr>
+                <w:rFonts w:cs="Arial"/>
+                <w:szCs w:val="22"/>
+              </w:rPr>
+              <w:t>Plausibilisierung findet statt, Feedback an Benutzer ist mangelhaft/nicht eindeutig/unvollständig. Nur korrekte Daten werden übermittelt.</w:t>
+            </w:r>
+          </w:p>
+        </w:tc>
+      </w:tr>
+      <w:tr>
+        <w:tc>
+          <w:tcPr>
+            <w:tcW w:w="1418" w:type="dxa"/>
+          </w:tcPr>
+          <w:p>
+            <w:pPr>
               <w:pStyle w:val="Textkrper"/>
               <w:ind w:left="0"/>
               <w:rPr>
@@ -11929,7 +12433,27 @@
                 <w:szCs w:val="22"/>
                 <w:lang w:val="de-CH"/>
               </w:rPr>
-              <w:t>Die Namensgebung ist ab und zu ungeschickt gewählt, Vorgaben sind teilweise berücksichtigt. Die Codestruktur ist uneinheitlich (so dass Lesbarkeit leidet).</w:t>
+              <w:t xml:space="preserve">Gütestufe 1 </w:t>
+            </w:r>
+          </w:p>
+        </w:tc>
+        <w:tc>
+          <w:tcPr>
+            <w:tcW w:w="7745" w:type="dxa"/>
+          </w:tcPr>
+          <w:p>
+            <w:pPr>
+              <w:rPr>
+                <w:rFonts w:cs="Arial"/>
+                <w:szCs w:val="22"/>
+              </w:rPr>
+            </w:pPr>
+            <w:r>
+              <w:rPr>
+                <w:rFonts w:cs="Arial"/>
+                <w:szCs w:val="22"/>
+              </w:rPr>
+              <w:t>Eingaben werden plausibilisiert, aber bei Fehlern oder fehlenden Eingaben sind die bisher gemachten Eingaben verloren oder die fehlerhaften Eingaben werden trotzdem übermittelt.</w:t>
             </w:r>
           </w:p>
         </w:tc>
@@ -11957,7 +12481,7 @@
                 <w:szCs w:val="22"/>
                 <w:lang w:val="de-CH"/>
               </w:rPr>
-              <w:t xml:space="preserve">Gütestufe 1 </w:t>
+              <w:t xml:space="preserve">Gütestufe 0 </w:t>
             </w:r>
           </w:p>
         </w:tc>
@@ -11977,55 +12501,7 @@
                 <w:rFonts w:cs="Arial"/>
                 <w:szCs w:val="22"/>
               </w:rPr>
-              <w:t>Die Namensgebung ist öfters verwirrend oder unpräzise. Dem Code fehlt es an einigen Stellen an klarer Struktur. Vorgaben sind nicht berücksichtigt.</w:t>
-            </w:r>
-          </w:p>
-        </w:tc>
-      </w:tr>
-      <w:tr>
-        <w:tc>
-          <w:tcPr>
-            <w:tcW w:w="1418" w:type="dxa"/>
-          </w:tcPr>
-          <w:p>
-            <w:pPr>
-              <w:pStyle w:val="Textkrper"/>
-              <w:ind w:left="0"/>
-              <w:rPr>
-                <w:rFonts w:cs="Arial"/>
-                <w:sz w:val="22"/>
-                <w:szCs w:val="22"/>
-                <w:lang w:val="de-CH"/>
-              </w:rPr>
-            </w:pPr>
-            <w:r>
-              <w:rPr>
-                <w:rFonts w:cs="Arial"/>
-                <w:sz w:val="22"/>
-                <w:szCs w:val="22"/>
-                <w:lang w:val="de-CH"/>
-              </w:rPr>
-              <w:t xml:space="preserve">Gütestufe 0 </w:t>
-            </w:r>
-          </w:p>
-        </w:tc>
-        <w:tc>
-          <w:tcPr>
-            <w:tcW w:w="7745" w:type="dxa"/>
-          </w:tcPr>
-          <w:p>
-            <w:pPr>
-              <w:rPr>
-                <w:rFonts w:cs="Arial"/>
-                <w:szCs w:val="22"/>
-              </w:rPr>
-            </w:pPr>
-            <w:r>
-              <w:rPr>
-                <w:rFonts w:cs="Arial"/>
-                <w:szCs w:val="22"/>
-              </w:rPr>
-              <w:t>Die Namensgebung ist verwirrend oder unpräzise. Der Code ist schlecht lesbar.</w:t>
+              <w:t>Es findet keine Plausibilisierung statt.</w:t>
             </w:r>
           </w:p>
         </w:tc>
@@ -12033,310 +12509,14 @@
     </w:tbl>
     <w:p>
       <w:pPr>
-        <w:pStyle w:val="Textkrper"/>
-        <w:ind w:left="0"/>
-        <w:rPr>
-          <w:rFonts w:cs="Arial"/>
-          <w:sz w:val="22"/>
-          <w:szCs w:val="22"/>
-          <w:lang w:val="de-CH"/>
-        </w:rPr>
-      </w:pPr>
-    </w:p>
-    <w:tbl>
-      <w:tblPr>
-        <w:tblStyle w:val="Tabellenraster"/>
-        <w:tblW w:w="0" w:type="auto"/>
-        <w:tblInd w:w="-147" w:type="dxa"/>
-        <w:tblLook w:val="04A0" w:firstRow="1" w:lastRow="0" w:firstColumn="1" w:lastColumn="0" w:noHBand="0" w:noVBand="1"/>
-      </w:tblPr>
-      <w:tblGrid>
-        <w:gridCol w:w="1418"/>
-        <w:gridCol w:w="7745"/>
-      </w:tblGrid>
-      <w:tr>
-        <w:tc>
-          <w:tcPr>
-            <w:tcW w:w="1418" w:type="dxa"/>
-            <w:shd w:val="clear" w:color="auto" w:fill="D9D9D9" w:themeFill="background1" w:themeFillShade="D9"/>
-          </w:tcPr>
-          <w:p>
-            <w:pPr>
-              <w:pStyle w:val="Textkrper"/>
-              <w:ind w:left="0"/>
-              <w:rPr>
-                <w:rFonts w:cs="Arial"/>
-                <w:sz w:val="22"/>
-                <w:szCs w:val="22"/>
-                <w:lang w:val="de-CH"/>
-              </w:rPr>
-            </w:pPr>
-            <w:r>
-              <w:rPr>
-                <w:rFonts w:cs="Arial"/>
-                <w:sz w:val="22"/>
-                <w:szCs w:val="22"/>
-                <w:lang w:val="de-CH"/>
-              </w:rPr>
-              <w:t>I6</w:t>
-            </w:r>
-          </w:p>
-        </w:tc>
-        <w:tc>
-          <w:tcPr>
-            <w:tcW w:w="7745" w:type="dxa"/>
-            <w:shd w:val="clear" w:color="auto" w:fill="D9D9D9" w:themeFill="background1" w:themeFillShade="D9"/>
-          </w:tcPr>
-          <w:p>
-            <w:pPr>
-              <w:rPr>
-                <w:rFonts w:cs="Arial"/>
-                <w:szCs w:val="22"/>
-              </w:rPr>
-            </w:pPr>
-            <w:r>
-              <w:rPr>
-                <w:rFonts w:cs="Arial"/>
-                <w:szCs w:val="22"/>
-              </w:rPr>
-              <w:t>Plausibilisierung der Benutzer-Eingaben</w:t>
-            </w:r>
-          </w:p>
-          <w:p>
-            <w:pPr>
-              <w:rPr>
-                <w:rFonts w:cs="Arial"/>
-                <w:szCs w:val="22"/>
-              </w:rPr>
-            </w:pPr>
-            <w:r>
-              <w:rPr>
-                <w:rFonts w:cs="Arial"/>
-                <w:szCs w:val="22"/>
-              </w:rPr>
-              <w:t>Definition (Leitfrage)</w:t>
-            </w:r>
-          </w:p>
-          <w:p>
-            <w:pPr>
-              <w:rPr>
-                <w:rFonts w:cs="Arial"/>
-                <w:szCs w:val="22"/>
-              </w:rPr>
-            </w:pPr>
-            <w:r>
-              <w:rPr>
-                <w:rFonts w:cs="Arial"/>
-                <w:szCs w:val="22"/>
-              </w:rPr>
-              <w:t>Werden die Eingaben des Benutzers überprüft?</w:t>
-            </w:r>
-          </w:p>
-        </w:tc>
-      </w:tr>
-      <w:tr>
-        <w:tc>
-          <w:tcPr>
-            <w:tcW w:w="1418" w:type="dxa"/>
-          </w:tcPr>
-          <w:p>
-            <w:pPr>
-              <w:pStyle w:val="Textkrper"/>
-              <w:ind w:left="0"/>
-              <w:rPr>
-                <w:rFonts w:cs="Arial"/>
-                <w:sz w:val="22"/>
-                <w:szCs w:val="22"/>
-                <w:lang w:val="de-CH"/>
-              </w:rPr>
-            </w:pPr>
-            <w:r>
-              <w:rPr>
-                <w:rFonts w:cs="Arial"/>
-                <w:sz w:val="22"/>
-                <w:szCs w:val="22"/>
-                <w:lang w:val="de-CH"/>
-              </w:rPr>
-              <w:t xml:space="preserve">Gütestufe 3 </w:t>
-            </w:r>
-          </w:p>
-        </w:tc>
-        <w:tc>
-          <w:tcPr>
-            <w:tcW w:w="7745" w:type="dxa"/>
-          </w:tcPr>
-          <w:p>
-            <w:pPr>
-              <w:rPr>
-                <w:rFonts w:cs="Arial"/>
-                <w:szCs w:val="22"/>
-              </w:rPr>
-            </w:pPr>
-            <w:r>
-              <w:rPr>
-                <w:rFonts w:cs="Arial"/>
-                <w:szCs w:val="22"/>
-              </w:rPr>
-              <w:t>Alle Eingabefelder werden überprüft. Es ist eindeutig gekennzeichnet, welche Felder Pflichtfelder sind. Für den Benutzer ist ersichtlich, welche Wertebereiche zulässig sind. Findet die Plausibilisierung eine Fehleingabe, so wird der Benutzer mit konkreten Hinweisen geführt, das entsprechende Feld wird aktiviert.</w:t>
-            </w:r>
-          </w:p>
-        </w:tc>
-      </w:tr>
-      <w:tr>
-        <w:tc>
-          <w:tcPr>
-            <w:tcW w:w="1418" w:type="dxa"/>
-          </w:tcPr>
-          <w:p>
-            <w:pPr>
-              <w:pStyle w:val="Textkrper"/>
-              <w:ind w:left="0"/>
-              <w:rPr>
-                <w:rFonts w:cs="Arial"/>
-                <w:sz w:val="22"/>
-                <w:szCs w:val="22"/>
-                <w:lang w:val="de-CH"/>
-              </w:rPr>
-            </w:pPr>
-            <w:r>
-              <w:rPr>
-                <w:rFonts w:cs="Arial"/>
-                <w:sz w:val="22"/>
-                <w:szCs w:val="22"/>
-                <w:lang w:val="de-CH"/>
-              </w:rPr>
-              <w:t xml:space="preserve">Gütestufe 2 </w:t>
-            </w:r>
-          </w:p>
-        </w:tc>
-        <w:tc>
-          <w:tcPr>
-            <w:tcW w:w="7745" w:type="dxa"/>
-          </w:tcPr>
-          <w:p>
-            <w:pPr>
-              <w:rPr>
-                <w:rFonts w:cs="Arial"/>
-                <w:szCs w:val="22"/>
-              </w:rPr>
-            </w:pPr>
-            <w:r>
-              <w:rPr>
-                <w:rFonts w:cs="Arial"/>
-                <w:szCs w:val="22"/>
-              </w:rPr>
-              <w:t>Plausibilisierung findet statt, Feedback an Benutzer ist mangelhaft/nicht eindeutig/unvollständig. Nur korrekte Daten werden übermittelt.</w:t>
-            </w:r>
-          </w:p>
-        </w:tc>
-      </w:tr>
-      <w:tr>
-        <w:tc>
-          <w:tcPr>
-            <w:tcW w:w="1418" w:type="dxa"/>
-          </w:tcPr>
-          <w:p>
-            <w:pPr>
-              <w:pStyle w:val="Textkrper"/>
-              <w:ind w:left="0"/>
-              <w:rPr>
-                <w:rFonts w:cs="Arial"/>
-                <w:sz w:val="22"/>
-                <w:szCs w:val="22"/>
-                <w:lang w:val="de-CH"/>
-              </w:rPr>
-            </w:pPr>
-            <w:r>
-              <w:rPr>
-                <w:rFonts w:cs="Arial"/>
-                <w:sz w:val="22"/>
-                <w:szCs w:val="22"/>
-                <w:lang w:val="de-CH"/>
-              </w:rPr>
-              <w:t xml:space="preserve">Gütestufe 1 </w:t>
-            </w:r>
-          </w:p>
-        </w:tc>
-        <w:tc>
-          <w:tcPr>
-            <w:tcW w:w="7745" w:type="dxa"/>
-          </w:tcPr>
-          <w:p>
-            <w:pPr>
-              <w:rPr>
-                <w:rFonts w:cs="Arial"/>
-                <w:szCs w:val="22"/>
-              </w:rPr>
-            </w:pPr>
-            <w:r>
-              <w:rPr>
-                <w:rFonts w:cs="Arial"/>
-                <w:szCs w:val="22"/>
-              </w:rPr>
-              <w:t>Eingaben werden plausibilisiert, aber bei Fehlern oder fehlenden Eingaben sind die bisher gemachten Eingaben verloren oder die fehlerhaften Eingaben werden trotzdem übermittelt.</w:t>
-            </w:r>
-          </w:p>
-        </w:tc>
-      </w:tr>
-      <w:tr>
-        <w:tc>
-          <w:tcPr>
-            <w:tcW w:w="1418" w:type="dxa"/>
-          </w:tcPr>
-          <w:p>
-            <w:pPr>
-              <w:pStyle w:val="Textkrper"/>
-              <w:ind w:left="0"/>
-              <w:rPr>
-                <w:rFonts w:cs="Arial"/>
-                <w:sz w:val="22"/>
-                <w:szCs w:val="22"/>
-                <w:lang w:val="de-CH"/>
-              </w:rPr>
-            </w:pPr>
-            <w:r>
-              <w:rPr>
-                <w:rFonts w:cs="Arial"/>
-                <w:sz w:val="22"/>
-                <w:szCs w:val="22"/>
-                <w:lang w:val="de-CH"/>
-              </w:rPr>
-              <w:t xml:space="preserve">Gütestufe 0 </w:t>
-            </w:r>
-          </w:p>
-        </w:tc>
-        <w:tc>
-          <w:tcPr>
-            <w:tcW w:w="7745" w:type="dxa"/>
-          </w:tcPr>
-          <w:p>
-            <w:pPr>
-              <w:rPr>
-                <w:rFonts w:cs="Arial"/>
-                <w:szCs w:val="22"/>
-              </w:rPr>
-            </w:pPr>
-            <w:r>
-              <w:rPr>
-                <w:rFonts w:cs="Arial"/>
-                <w:szCs w:val="22"/>
-              </w:rPr>
-              <w:t>Es findet keine Plausibilisierung statt.</w:t>
-            </w:r>
-          </w:p>
-        </w:tc>
-      </w:tr>
-    </w:tbl>
-    <w:p>
-      <w:pPr>
         <w:rPr>
           <w:lang w:eastAsia="en-US"/>
         </w:rPr>
       </w:pPr>
     </w:p>
     <w:sectPr>
-      <w:headerReference w:type="default" r:id="rId46"/>
-      <w:footerReference w:type="default" r:id="rId47"/>
+      <w:headerReference w:type="default" r:id="rId47"/>
+      <w:footerReference w:type="default" r:id="rId48"/>
       <w:pgSz w:w="11906" w:h="16838"/>
       <w:pgMar w:top="1440" w:right="1440" w:bottom="1440" w:left="1440" w:header="624" w:footer="510" w:gutter="0"/>
       <w:cols w:space="720"/>

</xml_diff>